<commit_message>
Updated the GHA lab
</commit_message>
<xml_diff>
--- a/Github Action/GitHub_Actions_Lab_basics.docx
+++ b/Github Action/GitHub_Actions_Lab_basics.docx
@@ -132,8 +132,6 @@
           <w:b/>
           <w:bCs/>
           <w:color w:val="000000"/>
-          <w:sz w:val="19"/>
-          <w:szCs w:val="19"/>
           <w:highlight w:val="white"/>
           <w:lang w:val="en-GB"/>
         </w:rPr>
@@ -144,8 +142,6 @@
           <w:b/>
           <w:bCs/>
           <w:color w:val="0000FF"/>
-          <w:sz w:val="19"/>
-          <w:szCs w:val="19"/>
           <w:highlight w:val="white"/>
           <w:lang w:val="en-GB"/>
         </w:rPr>
@@ -157,8 +153,6 @@
           <w:b/>
           <w:bCs/>
           <w:color w:val="800000"/>
-          <w:sz w:val="19"/>
-          <w:szCs w:val="19"/>
           <w:highlight w:val="white"/>
           <w:lang w:val="en-GB"/>
         </w:rPr>
@@ -170,8 +164,6 @@
           <w:b/>
           <w:bCs/>
           <w:color w:val="000000"/>
-          <w:sz w:val="19"/>
-          <w:szCs w:val="19"/>
           <w:highlight w:val="white"/>
           <w:lang w:val="en-GB"/>
         </w:rPr>
@@ -183,8 +175,6 @@
           <w:b/>
           <w:bCs/>
           <w:color w:val="FF0000"/>
-          <w:sz w:val="19"/>
-          <w:szCs w:val="19"/>
           <w:highlight w:val="white"/>
           <w:lang w:val="en-GB"/>
         </w:rPr>
@@ -196,8 +186,6 @@
           <w:b/>
           <w:bCs/>
           <w:color w:val="0000FF"/>
-          <w:sz w:val="19"/>
-          <w:szCs w:val="19"/>
           <w:highlight w:val="white"/>
           <w:lang w:val="en-GB"/>
         </w:rPr>
@@ -215,8 +203,6 @@
           <w:b/>
           <w:bCs/>
           <w:color w:val="000000"/>
-          <w:sz w:val="19"/>
-          <w:szCs w:val="19"/>
           <w:highlight w:val="white"/>
           <w:lang w:val="en-GB"/>
         </w:rPr>
@@ -227,8 +213,6 @@
           <w:b/>
           <w:bCs/>
           <w:color w:val="0000FF"/>
-          <w:sz w:val="19"/>
-          <w:szCs w:val="19"/>
           <w:highlight w:val="white"/>
           <w:lang w:val="en-GB"/>
         </w:rPr>
@@ -240,8 +224,6 @@
           <w:b/>
           <w:bCs/>
           <w:color w:val="800000"/>
-          <w:sz w:val="19"/>
-          <w:szCs w:val="19"/>
           <w:highlight w:val="white"/>
           <w:lang w:val="en-GB"/>
         </w:rPr>
@@ -253,8 +235,6 @@
           <w:b/>
           <w:bCs/>
           <w:color w:val="0000FF"/>
-          <w:sz w:val="19"/>
-          <w:szCs w:val="19"/>
           <w:highlight w:val="white"/>
           <w:lang w:val="en-GB"/>
         </w:rPr>
@@ -272,8 +252,6 @@
           <w:b/>
           <w:bCs/>
           <w:color w:val="000000"/>
-          <w:sz w:val="19"/>
-          <w:szCs w:val="19"/>
           <w:highlight w:val="white"/>
           <w:lang w:val="en-GB"/>
         </w:rPr>
@@ -284,8 +262,6 @@
           <w:b/>
           <w:bCs/>
           <w:color w:val="0000FF"/>
-          <w:sz w:val="19"/>
-          <w:szCs w:val="19"/>
           <w:highlight w:val="white"/>
           <w:lang w:val="en-GB"/>
         </w:rPr>
@@ -297,8 +273,6 @@
           <w:b/>
           <w:bCs/>
           <w:color w:val="800000"/>
-          <w:sz w:val="19"/>
-          <w:szCs w:val="19"/>
           <w:highlight w:val="white"/>
           <w:lang w:val="en-GB"/>
         </w:rPr>
@@ -310,8 +284,6 @@
           <w:b/>
           <w:bCs/>
           <w:color w:val="0000FF"/>
-          <w:sz w:val="19"/>
-          <w:szCs w:val="19"/>
           <w:highlight w:val="white"/>
           <w:lang w:val="en-GB"/>
         </w:rPr>
@@ -329,8 +301,6 @@
           <w:b/>
           <w:bCs/>
           <w:color w:val="000000"/>
-          <w:sz w:val="19"/>
-          <w:szCs w:val="19"/>
           <w:highlight w:val="white"/>
           <w:lang w:val="en-GB"/>
         </w:rPr>
@@ -341,8 +311,6 @@
           <w:b/>
           <w:bCs/>
           <w:color w:val="000000"/>
-          <w:sz w:val="19"/>
-          <w:szCs w:val="19"/>
           <w:highlight w:val="white"/>
           <w:lang w:val="en-GB"/>
         </w:rPr>
@@ -354,8 +322,6 @@
           <w:b/>
           <w:bCs/>
           <w:color w:val="0000FF"/>
-          <w:sz w:val="19"/>
-          <w:szCs w:val="19"/>
           <w:highlight w:val="white"/>
           <w:lang w:val="en-GB"/>
         </w:rPr>
@@ -367,8 +333,6 @@
           <w:b/>
           <w:bCs/>
           <w:color w:val="800000"/>
-          <w:sz w:val="19"/>
-          <w:szCs w:val="19"/>
           <w:highlight w:val="white"/>
           <w:lang w:val="en-GB"/>
         </w:rPr>
@@ -380,8 +344,6 @@
           <w:b/>
           <w:bCs/>
           <w:color w:val="0000FF"/>
-          <w:sz w:val="19"/>
-          <w:szCs w:val="19"/>
           <w:highlight w:val="white"/>
           <w:lang w:val="en-GB"/>
         </w:rPr>
@@ -393,8 +355,6 @@
           <w:b/>
           <w:bCs/>
           <w:color w:val="000000"/>
-          <w:sz w:val="19"/>
-          <w:szCs w:val="19"/>
           <w:highlight w:val="white"/>
           <w:lang w:val="en-GB"/>
         </w:rPr>
@@ -406,8 +366,6 @@
           <w:b/>
           <w:bCs/>
           <w:color w:val="0000FF"/>
-          <w:sz w:val="19"/>
-          <w:szCs w:val="19"/>
           <w:highlight w:val="white"/>
           <w:lang w:val="en-GB"/>
         </w:rPr>
@@ -419,8 +377,6 @@
           <w:b/>
           <w:bCs/>
           <w:color w:val="800000"/>
-          <w:sz w:val="19"/>
-          <w:szCs w:val="19"/>
           <w:highlight w:val="white"/>
           <w:lang w:val="en-GB"/>
         </w:rPr>
@@ -432,8 +388,6 @@
           <w:b/>
           <w:bCs/>
           <w:color w:val="0000FF"/>
-          <w:sz w:val="19"/>
-          <w:szCs w:val="19"/>
           <w:highlight w:val="white"/>
           <w:lang w:val="en-GB"/>
         </w:rPr>
@@ -451,8 +405,6 @@
           <w:b/>
           <w:bCs/>
           <w:color w:val="000000"/>
-          <w:sz w:val="19"/>
-          <w:szCs w:val="19"/>
           <w:highlight w:val="white"/>
           <w:lang w:val="en-GB"/>
         </w:rPr>
@@ -463,8 +415,6 @@
           <w:b/>
           <w:bCs/>
           <w:color w:val="0000FF"/>
-          <w:sz w:val="19"/>
-          <w:szCs w:val="19"/>
           <w:highlight w:val="white"/>
           <w:lang w:val="en-GB"/>
         </w:rPr>
@@ -476,8 +426,6 @@
           <w:b/>
           <w:bCs/>
           <w:color w:val="800000"/>
-          <w:sz w:val="19"/>
-          <w:szCs w:val="19"/>
           <w:highlight w:val="white"/>
           <w:lang w:val="en-GB"/>
         </w:rPr>
@@ -489,8 +437,6 @@
           <w:b/>
           <w:bCs/>
           <w:color w:val="0000FF"/>
-          <w:sz w:val="19"/>
-          <w:szCs w:val="19"/>
           <w:highlight w:val="white"/>
           <w:lang w:val="en-GB"/>
         </w:rPr>
@@ -508,8 +454,6 @@
           <w:b/>
           <w:bCs/>
           <w:color w:val="000000"/>
-          <w:sz w:val="19"/>
-          <w:szCs w:val="19"/>
           <w:highlight w:val="white"/>
           <w:lang w:val="en-GB"/>
         </w:rPr>
@@ -520,8 +464,6 @@
           <w:b/>
           <w:bCs/>
           <w:color w:val="0000FF"/>
-          <w:sz w:val="19"/>
-          <w:szCs w:val="19"/>
           <w:highlight w:val="white"/>
           <w:lang w:val="en-GB"/>
         </w:rPr>
@@ -533,8 +475,6 @@
           <w:b/>
           <w:bCs/>
           <w:color w:val="800000"/>
-          <w:sz w:val="19"/>
-          <w:szCs w:val="19"/>
           <w:highlight w:val="white"/>
           <w:lang w:val="en-GB"/>
         </w:rPr>
@@ -546,8 +486,6 @@
           <w:b/>
           <w:bCs/>
           <w:color w:val="0000FF"/>
-          <w:sz w:val="19"/>
-          <w:szCs w:val="19"/>
           <w:highlight w:val="white"/>
           <w:lang w:val="en-GB"/>
         </w:rPr>
@@ -565,8 +503,6 @@
           <w:b/>
           <w:bCs/>
           <w:color w:val="000000"/>
-          <w:sz w:val="19"/>
-          <w:szCs w:val="19"/>
           <w:highlight w:val="white"/>
           <w:lang w:val="en-GB"/>
         </w:rPr>
@@ -577,8 +513,6 @@
           <w:b/>
           <w:bCs/>
           <w:color w:val="000000"/>
-          <w:sz w:val="19"/>
-          <w:szCs w:val="19"/>
           <w:highlight w:val="white"/>
           <w:lang w:val="en-GB"/>
         </w:rPr>
@@ -590,8 +524,6 @@
           <w:b/>
           <w:bCs/>
           <w:color w:val="0000FF"/>
-          <w:sz w:val="19"/>
-          <w:szCs w:val="19"/>
           <w:highlight w:val="white"/>
           <w:lang w:val="en-GB"/>
         </w:rPr>
@@ -603,8 +535,6 @@
           <w:b/>
           <w:bCs/>
           <w:color w:val="800000"/>
-          <w:sz w:val="19"/>
-          <w:szCs w:val="19"/>
           <w:highlight w:val="white"/>
           <w:lang w:val="en-GB"/>
         </w:rPr>
@@ -616,8 +546,6 @@
           <w:b/>
           <w:bCs/>
           <w:color w:val="0000FF"/>
-          <w:sz w:val="19"/>
-          <w:szCs w:val="19"/>
           <w:highlight w:val="white"/>
           <w:lang w:val="en-GB"/>
         </w:rPr>
@@ -629,8 +557,6 @@
           <w:b/>
           <w:bCs/>
           <w:color w:val="000000"/>
-          <w:sz w:val="19"/>
-          <w:szCs w:val="19"/>
           <w:highlight w:val="white"/>
           <w:lang w:val="en-GB"/>
         </w:rPr>
@@ -642,8 +568,6 @@
           <w:b/>
           <w:bCs/>
           <w:color w:val="0000FF"/>
-          <w:sz w:val="19"/>
-          <w:szCs w:val="19"/>
           <w:highlight w:val="white"/>
           <w:lang w:val="en-GB"/>
         </w:rPr>
@@ -655,8 +579,6 @@
           <w:b/>
           <w:bCs/>
           <w:color w:val="800000"/>
-          <w:sz w:val="19"/>
-          <w:szCs w:val="19"/>
           <w:highlight w:val="white"/>
           <w:lang w:val="en-GB"/>
         </w:rPr>
@@ -668,8 +590,6 @@
           <w:b/>
           <w:bCs/>
           <w:color w:val="0000FF"/>
-          <w:sz w:val="19"/>
-          <w:szCs w:val="19"/>
           <w:highlight w:val="white"/>
           <w:lang w:val="en-GB"/>
         </w:rPr>
@@ -687,8 +607,6 @@
           <w:b/>
           <w:bCs/>
           <w:color w:val="000000"/>
-          <w:sz w:val="19"/>
-          <w:szCs w:val="19"/>
           <w:highlight w:val="white"/>
           <w:lang w:val="en-GB"/>
         </w:rPr>
@@ -699,8 +617,6 @@
           <w:b/>
           <w:bCs/>
           <w:color w:val="000000"/>
-          <w:sz w:val="19"/>
-          <w:szCs w:val="19"/>
           <w:highlight w:val="white"/>
           <w:lang w:val="en-GB"/>
         </w:rPr>
@@ -712,8 +628,6 @@
           <w:b/>
           <w:bCs/>
           <w:color w:val="0000FF"/>
-          <w:sz w:val="19"/>
-          <w:szCs w:val="19"/>
           <w:highlight w:val="white"/>
           <w:lang w:val="en-GB"/>
         </w:rPr>
@@ -725,8 +639,6 @@
           <w:b/>
           <w:bCs/>
           <w:color w:val="800000"/>
-          <w:sz w:val="19"/>
-          <w:szCs w:val="19"/>
           <w:highlight w:val="white"/>
           <w:lang w:val="en-GB"/>
         </w:rPr>
@@ -738,8 +650,6 @@
           <w:b/>
           <w:bCs/>
           <w:color w:val="0000FF"/>
-          <w:sz w:val="19"/>
-          <w:szCs w:val="19"/>
           <w:highlight w:val="white"/>
           <w:lang w:val="en-GB"/>
         </w:rPr>
@@ -751,8 +661,6 @@
           <w:b/>
           <w:bCs/>
           <w:color w:val="000000"/>
-          <w:sz w:val="19"/>
-          <w:szCs w:val="19"/>
           <w:highlight w:val="white"/>
           <w:lang w:val="en-GB"/>
         </w:rPr>
@@ -764,8 +672,6 @@
           <w:b/>
           <w:bCs/>
           <w:color w:val="0000FF"/>
-          <w:sz w:val="19"/>
-          <w:szCs w:val="19"/>
           <w:highlight w:val="white"/>
           <w:lang w:val="en-GB"/>
         </w:rPr>
@@ -777,8 +683,6 @@
           <w:b/>
           <w:bCs/>
           <w:color w:val="800000"/>
-          <w:sz w:val="19"/>
-          <w:szCs w:val="19"/>
           <w:highlight w:val="white"/>
           <w:lang w:val="en-GB"/>
         </w:rPr>
@@ -790,8 +694,6 @@
           <w:b/>
           <w:bCs/>
           <w:color w:val="0000FF"/>
-          <w:sz w:val="19"/>
-          <w:szCs w:val="19"/>
           <w:highlight w:val="white"/>
           <w:lang w:val="en-GB"/>
         </w:rPr>
@@ -809,8 +711,6 @@
           <w:b/>
           <w:bCs/>
           <w:color w:val="000000"/>
-          <w:sz w:val="19"/>
-          <w:szCs w:val="19"/>
           <w:highlight w:val="white"/>
           <w:lang w:val="en-GB"/>
         </w:rPr>
@@ -821,8 +721,6 @@
           <w:b/>
           <w:bCs/>
           <w:color w:val="0000FF"/>
-          <w:sz w:val="19"/>
-          <w:szCs w:val="19"/>
           <w:highlight w:val="white"/>
           <w:lang w:val="en-GB"/>
         </w:rPr>
@@ -834,8 +732,6 @@
           <w:b/>
           <w:bCs/>
           <w:color w:val="800000"/>
-          <w:sz w:val="19"/>
-          <w:szCs w:val="19"/>
           <w:highlight w:val="white"/>
           <w:lang w:val="en-GB"/>
         </w:rPr>
@@ -847,8 +743,6 @@
           <w:b/>
           <w:bCs/>
           <w:color w:val="0000FF"/>
-          <w:sz w:val="19"/>
-          <w:szCs w:val="19"/>
           <w:highlight w:val="white"/>
           <w:lang w:val="en-GB"/>
         </w:rPr>
@@ -866,8 +760,6 @@
           <w:b/>
           <w:bCs/>
           <w:color w:val="000000"/>
-          <w:sz w:val="19"/>
-          <w:szCs w:val="19"/>
           <w:highlight w:val="white"/>
           <w:lang w:val="en-GB"/>
         </w:rPr>
@@ -878,8 +770,6 @@
           <w:b/>
           <w:bCs/>
           <w:color w:val="0000FF"/>
-          <w:sz w:val="19"/>
-          <w:szCs w:val="19"/>
           <w:highlight w:val="white"/>
           <w:lang w:val="en-GB"/>
         </w:rPr>
@@ -891,8 +781,6 @@
           <w:b/>
           <w:bCs/>
           <w:color w:val="800000"/>
-          <w:sz w:val="19"/>
-          <w:szCs w:val="19"/>
           <w:highlight w:val="white"/>
           <w:lang w:val="en-GB"/>
         </w:rPr>
@@ -904,8 +792,6 @@
           <w:b/>
           <w:bCs/>
           <w:color w:val="0000FF"/>
-          <w:sz w:val="19"/>
-          <w:szCs w:val="19"/>
           <w:highlight w:val="white"/>
           <w:lang w:val="en-GB"/>
         </w:rPr>
@@ -917,98 +803,347 @@
       <w:r>
         <w:t>Commit and push the file to the main branch.</w:t>
       </w:r>
+      <w:r>
+        <w:br/>
+        <w:t>Follow the instruction below if you are new to Git</w:t>
+      </w:r>
+      <w:r>
+        <w:br/>
+      </w:r>
+      <w:r>
+        <w:br/>
+      </w:r>
+      <w:r>
+        <w:lastRenderedPageBreak/>
+        <w:t xml:space="preserve">Create a new repo in Git like </w:t>
+      </w:r>
+      <w:r>
+        <w:drawing>
+          <wp:inline distT="0" distB="0" distL="0" distR="0" wp14:anchorId="743B27EF" wp14:editId="5F865C33">
+            <wp:extent cx="5107027" cy="666750"/>
+            <wp:effectExtent l="19050" t="19050" r="17780" b="19050"/>
+            <wp:docPr id="1264761167" name="Picture 1"/>
+            <wp:cNvGraphicFramePr>
+              <a:graphicFrameLocks xmlns:a="http://schemas.openxmlformats.org/drawingml/2006/main" noChangeAspect="1"/>
+            </wp:cNvGraphicFramePr>
+            <a:graphic xmlns:a="http://schemas.openxmlformats.org/drawingml/2006/main">
+              <a:graphicData uri="http://schemas.openxmlformats.org/drawingml/2006/picture">
+                <pic:pic xmlns:pic="http://schemas.openxmlformats.org/drawingml/2006/picture">
+                  <pic:nvPicPr>
+                    <pic:cNvPr id="1264761167" name=""/>
+                    <pic:cNvPicPr/>
+                  </pic:nvPicPr>
+                  <pic:blipFill>
+                    <a:blip r:embed="rId6"/>
+                    <a:stretch>
+                      <a:fillRect/>
+                    </a:stretch>
+                  </pic:blipFill>
+                  <pic:spPr>
+                    <a:xfrm>
+                      <a:off x="0" y="0"/>
+                      <a:ext cx="5148448" cy="672158"/>
+                    </a:xfrm>
+                    <a:prstGeom prst="rect">
+                      <a:avLst/>
+                    </a:prstGeom>
+                    <a:ln>
+                      <a:solidFill>
+                        <a:schemeClr val="bg1">
+                          <a:lumMod val="85000"/>
+                        </a:schemeClr>
+                      </a:solidFill>
+                    </a:ln>
+                  </pic:spPr>
+                </pic:pic>
+              </a:graphicData>
+            </a:graphic>
+          </wp:inline>
+        </w:drawing>
+      </w:r>
     </w:p>
     <w:p>
       <w:pPr>
-        <w:pStyle w:val="Heading2"/>
-      </w:pPr>
-      <w:r>
-        <w:t>Step 2: Create the Workflow</w:t>
-      </w:r>
+        <w:spacing w:after="0"/>
+        <w:rPr>
+          <w:rFonts w:ascii="Courier New" w:hAnsi="Courier New" w:cs="Courier New"/>
+          <w:b/>
+          <w:bCs/>
+          <w:sz w:val="24"/>
+          <w:szCs w:val="24"/>
+          <w:lang w:val="en-GB"/>
+        </w:rPr>
+      </w:pPr>
+      <w:r>
+        <w:t>In the same folder where index.html saved:</w:t>
+      </w:r>
+      <w:r>
+        <w:br/>
+      </w:r>
+      <w:r>
+        <w:rPr>
+          <w:rFonts w:ascii="Courier New" w:hAnsi="Courier New" w:cs="Courier New"/>
+          <w:b/>
+          <w:bCs/>
+          <w:sz w:val="24"/>
+          <w:szCs w:val="24"/>
+          <w:lang w:val="en-GB"/>
+        </w:rPr>
+        <w:t xml:space="preserve">git </w:t>
+      </w:r>
+      <w:proofErr w:type="spellStart"/>
+      <w:r>
+        <w:rPr>
+          <w:rFonts w:ascii="Courier New" w:hAnsi="Courier New" w:cs="Courier New"/>
+          <w:b/>
+          <w:bCs/>
+          <w:sz w:val="24"/>
+          <w:szCs w:val="24"/>
+          <w:lang w:val="en-GB"/>
+        </w:rPr>
+        <w:t>init</w:t>
+      </w:r>
+      <w:proofErr w:type="spellEnd"/>
     </w:p>
     <w:p>
-      <w:r>
-        <w:t>Create the following folder structure in your repository:</w:t>
+      <w:pPr>
+        <w:spacing w:after="0"/>
+        <w:rPr>
+          <w:rFonts w:ascii="Courier New" w:hAnsi="Courier New" w:cs="Courier New"/>
+          <w:b/>
+          <w:bCs/>
+          <w:sz w:val="24"/>
+          <w:szCs w:val="24"/>
+          <w:lang w:val="en-GB"/>
+        </w:rPr>
+      </w:pPr>
+      <w:r>
+        <w:rPr>
+          <w:rFonts w:ascii="Courier New" w:hAnsi="Courier New" w:cs="Courier New"/>
+          <w:b/>
+          <w:bCs/>
+          <w:sz w:val="24"/>
+          <w:szCs w:val="24"/>
+          <w:lang w:val="en-GB"/>
+        </w:rPr>
+        <w:t xml:space="preserve">git add </w:t>
+      </w:r>
+      <w:r>
+        <w:rPr>
+          <w:rFonts w:ascii="Courier New" w:hAnsi="Courier New" w:cs="Courier New"/>
+          <w:b/>
+          <w:bCs/>
+          <w:sz w:val="24"/>
+          <w:szCs w:val="24"/>
+          <w:lang w:val="en-GB"/>
+        </w:rPr>
+        <w:t>.</w:t>
       </w:r>
     </w:p>
     <w:p>
       <w:pPr>
-        <w:rPr>
-          <w:b/>
-          <w:bCs/>
-        </w:rPr>
-      </w:pPr>
-      <w:r>
-        <w:rPr>
-          <w:b/>
-          <w:bCs/>
-        </w:rPr>
-        <w:t>.</w:t>
-      </w:r>
-      <w:proofErr w:type="spellStart"/>
-      <w:r>
-        <w:rPr>
-          <w:b/>
-          <w:bCs/>
-        </w:rPr>
-        <w:t>github</w:t>
-      </w:r>
-      <w:proofErr w:type="spellEnd"/>
-      <w:r>
-        <w:rPr>
-          <w:b/>
-          <w:bCs/>
-        </w:rPr>
-        <w:t>/workflows</w:t>
+        <w:spacing w:after="0"/>
+        <w:rPr>
+          <w:rFonts w:ascii="Courier New" w:hAnsi="Courier New" w:cs="Courier New"/>
+          <w:b/>
+          <w:bCs/>
+          <w:sz w:val="24"/>
+          <w:szCs w:val="24"/>
+          <w:lang w:val="en-GB"/>
+        </w:rPr>
+      </w:pPr>
+      <w:r>
+        <w:rPr>
+          <w:rFonts w:ascii="Courier New" w:hAnsi="Courier New" w:cs="Courier New"/>
+          <w:b/>
+          <w:bCs/>
+          <w:sz w:val="24"/>
+          <w:szCs w:val="24"/>
+          <w:lang w:val="en-GB"/>
+        </w:rPr>
+        <w:t>git commit -m "first commit"</w:t>
       </w:r>
     </w:p>
     <w:p>
-      <w:r>
-        <w:t xml:space="preserve">Inside this folder, create a file called </w:t>
-      </w:r>
-      <w:r>
-        <w:rPr>
+      <w:pPr>
+        <w:spacing w:after="0"/>
+        <w:rPr>
+          <w:rFonts w:ascii="Courier New" w:hAnsi="Courier New" w:cs="Courier New"/>
           <w:b/>
           <w:bCs/>
           <w:sz w:val="24"/>
           <w:szCs w:val="24"/>
-        </w:rPr>
-        <w:t>ci.yml</w:t>
-      </w:r>
-      <w:r>
-        <w:t>.</w:t>
+          <w:lang w:val="en-GB"/>
+        </w:rPr>
+      </w:pPr>
+      <w:r>
+        <w:rPr>
+          <w:rFonts w:ascii="Courier New" w:hAnsi="Courier New" w:cs="Courier New"/>
+          <w:b/>
+          <w:bCs/>
+          <w:sz w:val="24"/>
+          <w:szCs w:val="24"/>
+          <w:lang w:val="en-GB"/>
+        </w:rPr>
+        <w:t>git branch -M main</w:t>
       </w:r>
     </w:p>
     <w:p>
       <w:pPr>
-        <w:pStyle w:val="Heading2"/>
-      </w:pPr>
-      <w:r>
-        <w:lastRenderedPageBreak/>
-        <w:t>Step 3: Define the Pipeline</w:t>
+        <w:spacing w:after="0"/>
+        <w:rPr>
+          <w:rFonts w:asciiTheme="majorBidi" w:hAnsiTheme="majorBidi" w:cstheme="majorBidi"/>
+          <w:b/>
+          <w:bCs/>
+          <w:sz w:val="24"/>
+          <w:szCs w:val="24"/>
+          <w:lang w:val="en-GB"/>
+        </w:rPr>
+      </w:pPr>
+      <w:r>
+        <w:rPr>
+          <w:rFonts w:ascii="Courier New" w:hAnsi="Courier New" w:cs="Courier New"/>
+          <w:b/>
+          <w:bCs/>
+          <w:sz w:val="24"/>
+          <w:szCs w:val="24"/>
+          <w:lang w:val="en-GB"/>
+        </w:rPr>
+        <w:t xml:space="preserve">git remote add origin </w:t>
+      </w:r>
+      <w:r>
+        <w:rPr>
+          <w:rFonts w:asciiTheme="majorBidi" w:hAnsiTheme="majorBidi" w:cstheme="majorBidi"/>
+          <w:b/>
+          <w:bCs/>
+          <w:sz w:val="24"/>
+          <w:szCs w:val="24"/>
+          <w:lang w:val="en-GB"/>
+        </w:rPr>
+        <w:t>https://github.com/mikebaradaran/githu-action1.git</w:t>
       </w:r>
     </w:p>
     <w:p>
-      <w:r>
-        <w:t xml:space="preserve">Add the following GitHub Actions workflow to </w:t>
-      </w:r>
-      <w:proofErr w:type="spellStart"/>
-      <w:r>
-        <w:rPr>
+      <w:pPr>
+        <w:spacing w:after="0"/>
+        <w:rPr>
+          <w:rFonts w:ascii="Courier New" w:hAnsi="Courier New" w:cs="Courier New"/>
           <w:b/>
           <w:bCs/>
           <w:sz w:val="24"/>
           <w:szCs w:val="24"/>
-        </w:rPr>
-        <w:t>ci.yml</w:t>
-      </w:r>
-      <w:proofErr w:type="spellEnd"/>
-      <w:r>
-        <w:t>:</w:t>
+          <w:lang w:val="en-GB"/>
+        </w:rPr>
+      </w:pPr>
+      <w:r>
+        <w:rPr>
+          <w:rFonts w:ascii="Courier New" w:hAnsi="Courier New" w:cs="Courier New"/>
+          <w:b/>
+          <w:bCs/>
+          <w:sz w:val="24"/>
+          <w:szCs w:val="24"/>
+          <w:lang w:val="en-GB"/>
+        </w:rPr>
+        <w:t>git push -u origin main</w:t>
+      </w:r>
+    </w:p>
+    <w:p/>
+    <w:p>
+      <w:pPr>
+        <w:pStyle w:val="Heading2"/>
+      </w:pPr>
+      <w:r>
+        <w:t>Step 2: Create the Workflow</w:t>
       </w:r>
     </w:p>
     <w:p>
-      <w:pPr>
+      <w:r>
+        <w:t>Create the following folder structure in your repository:</w:t>
+      </w:r>
+    </w:p>
+    <w:p>
+      <w:pPr>
+        <w:rPr>
+          <w:b/>
+          <w:bCs/>
+        </w:rPr>
+      </w:pPr>
+      <w:r>
+        <w:rPr>
+          <w:b/>
+          <w:bCs/>
+        </w:rPr>
+        <w:t>.</w:t>
+      </w:r>
+      <w:proofErr w:type="spellStart"/>
+      <w:r>
+        <w:rPr>
+          <w:b/>
+          <w:bCs/>
+        </w:rPr>
+        <w:t>github</w:t>
+      </w:r>
+      <w:proofErr w:type="spellEnd"/>
+      <w:r>
+        <w:rPr>
+          <w:b/>
+          <w:bCs/>
+        </w:rPr>
+        <w:t>/workflows</w:t>
+      </w:r>
+    </w:p>
+    <w:p>
+      <w:r>
+        <w:t xml:space="preserve">Inside this folder, create a file called </w:t>
+      </w:r>
+      <w:r>
+        <w:rPr>
+          <w:b/>
+          <w:bCs/>
+          <w:sz w:val="24"/>
+          <w:szCs w:val="24"/>
+        </w:rPr>
+        <w:t>ci.yml</w:t>
+      </w:r>
+      <w:r>
+        <w:t>.</w:t>
+      </w:r>
+    </w:p>
+    <w:p>
+      <w:pPr>
+        <w:pStyle w:val="Heading2"/>
+      </w:pPr>
+      <w:r>
+        <w:t>Step 3: Define the Pipeline</w:t>
+      </w:r>
+    </w:p>
+    <w:p>
+      <w:r>
+        <w:t xml:space="preserve">Add the following GitHub Actions workflow to </w:t>
+      </w:r>
+      <w:proofErr w:type="spellStart"/>
+      <w:r>
+        <w:rPr>
+          <w:b/>
+          <w:bCs/>
+          <w:sz w:val="24"/>
+          <w:szCs w:val="24"/>
+        </w:rPr>
+        <w:t>ci.yml</w:t>
+      </w:r>
+      <w:proofErr w:type="spellEnd"/>
+      <w:r>
+        <w:t>:</w:t>
+      </w:r>
+    </w:p>
+    <w:p>
+      <w:pPr>
+        <w:pBdr>
+          <w:top w:val="single" w:sz="4" w:space="1" w:color="auto"/>
+          <w:left w:val="single" w:sz="4" w:space="4" w:color="auto"/>
+          <w:bottom w:val="single" w:sz="4" w:space="1" w:color="auto"/>
+          <w:right w:val="single" w:sz="4" w:space="0" w:color="auto"/>
+        </w:pBdr>
         <w:autoSpaceDE w:val="0"/>
         <w:autoSpaceDN w:val="0"/>
         <w:adjustRightInd w:val="0"/>
@@ -1066,6 +1201,12 @@
     </w:p>
     <w:p>
       <w:pPr>
+        <w:pBdr>
+          <w:top w:val="single" w:sz="4" w:space="1" w:color="auto"/>
+          <w:left w:val="single" w:sz="4" w:space="4" w:color="auto"/>
+          <w:bottom w:val="single" w:sz="4" w:space="1" w:color="auto"/>
+          <w:right w:val="single" w:sz="4" w:space="0" w:color="auto"/>
+        </w:pBdr>
         <w:autoSpaceDE w:val="0"/>
         <w:autoSpaceDN w:val="0"/>
         <w:adjustRightInd w:val="0"/>
@@ -1097,6 +1238,12 @@
     </w:p>
     <w:p>
       <w:pPr>
+        <w:pBdr>
+          <w:top w:val="single" w:sz="4" w:space="1" w:color="auto"/>
+          <w:left w:val="single" w:sz="4" w:space="4" w:color="auto"/>
+          <w:bottom w:val="single" w:sz="4" w:space="1" w:color="auto"/>
+          <w:right w:val="single" w:sz="4" w:space="0" w:color="auto"/>
+        </w:pBdr>
         <w:autoSpaceDE w:val="0"/>
         <w:autoSpaceDN w:val="0"/>
         <w:adjustRightInd w:val="0"/>
@@ -1141,6 +1288,12 @@
     </w:p>
     <w:p>
       <w:pPr>
+        <w:pBdr>
+          <w:top w:val="single" w:sz="4" w:space="1" w:color="auto"/>
+          <w:left w:val="single" w:sz="4" w:space="4" w:color="auto"/>
+          <w:bottom w:val="single" w:sz="4" w:space="1" w:color="auto"/>
+          <w:right w:val="single" w:sz="4" w:space="0" w:color="auto"/>
+        </w:pBdr>
         <w:autoSpaceDE w:val="0"/>
         <w:autoSpaceDN w:val="0"/>
         <w:adjustRightInd w:val="0"/>
@@ -1224,6 +1377,12 @@
     </w:p>
     <w:p>
       <w:pPr>
+        <w:pBdr>
+          <w:top w:val="single" w:sz="4" w:space="1" w:color="auto"/>
+          <w:left w:val="single" w:sz="4" w:space="4" w:color="auto"/>
+          <w:bottom w:val="single" w:sz="4" w:space="1" w:color="auto"/>
+          <w:right w:val="single" w:sz="4" w:space="0" w:color="auto"/>
+        </w:pBdr>
         <w:autoSpaceDE w:val="0"/>
         <w:autoSpaceDN w:val="0"/>
         <w:adjustRightInd w:val="0"/>
@@ -1242,6 +1401,12 @@
     </w:p>
     <w:p>
       <w:pPr>
+        <w:pBdr>
+          <w:top w:val="single" w:sz="4" w:space="1" w:color="auto"/>
+          <w:left w:val="single" w:sz="4" w:space="4" w:color="auto"/>
+          <w:bottom w:val="single" w:sz="4" w:space="1" w:color="auto"/>
+          <w:right w:val="single" w:sz="4" w:space="0" w:color="auto"/>
+        </w:pBdr>
         <w:autoSpaceDE w:val="0"/>
         <w:autoSpaceDN w:val="0"/>
         <w:adjustRightInd w:val="0"/>
@@ -1273,6 +1438,12 @@
     </w:p>
     <w:p>
       <w:pPr>
+        <w:pBdr>
+          <w:top w:val="single" w:sz="4" w:space="1" w:color="auto"/>
+          <w:left w:val="single" w:sz="4" w:space="4" w:color="auto"/>
+          <w:bottom w:val="single" w:sz="4" w:space="1" w:color="auto"/>
+          <w:right w:val="single" w:sz="4" w:space="0" w:color="auto"/>
+        </w:pBdr>
         <w:autoSpaceDE w:val="0"/>
         <w:autoSpaceDN w:val="0"/>
         <w:adjustRightInd w:val="0"/>
@@ -1317,6 +1488,12 @@
     </w:p>
     <w:p>
       <w:pPr>
+        <w:pBdr>
+          <w:top w:val="single" w:sz="4" w:space="1" w:color="auto"/>
+          <w:left w:val="single" w:sz="4" w:space="4" w:color="auto"/>
+          <w:bottom w:val="single" w:sz="4" w:space="1" w:color="auto"/>
+          <w:right w:val="single" w:sz="4" w:space="0" w:color="auto"/>
+        </w:pBdr>
         <w:autoSpaceDE w:val="0"/>
         <w:autoSpaceDN w:val="0"/>
         <w:adjustRightInd w:val="0"/>
@@ -1387,6 +1564,12 @@
     </w:p>
     <w:p>
       <w:pPr>
+        <w:pBdr>
+          <w:top w:val="single" w:sz="4" w:space="1" w:color="auto"/>
+          <w:left w:val="single" w:sz="4" w:space="4" w:color="auto"/>
+          <w:bottom w:val="single" w:sz="4" w:space="1" w:color="auto"/>
+          <w:right w:val="single" w:sz="4" w:space="0" w:color="auto"/>
+        </w:pBdr>
         <w:autoSpaceDE w:val="0"/>
         <w:autoSpaceDN w:val="0"/>
         <w:adjustRightInd w:val="0"/>
@@ -1431,6 +1614,12 @@
     </w:p>
     <w:p>
       <w:pPr>
+        <w:pBdr>
+          <w:top w:val="single" w:sz="4" w:space="1" w:color="auto"/>
+          <w:left w:val="single" w:sz="4" w:space="4" w:color="auto"/>
+          <w:bottom w:val="single" w:sz="4" w:space="1" w:color="auto"/>
+          <w:right w:val="single" w:sz="4" w:space="0" w:color="auto"/>
+        </w:pBdr>
         <w:autoSpaceDE w:val="0"/>
         <w:autoSpaceDN w:val="0"/>
         <w:adjustRightInd w:val="0"/>
@@ -1501,6 +1690,12 @@
     </w:p>
     <w:p>
       <w:pPr>
+        <w:pBdr>
+          <w:top w:val="single" w:sz="4" w:space="1" w:color="auto"/>
+          <w:left w:val="single" w:sz="4" w:space="4" w:color="auto"/>
+          <w:bottom w:val="single" w:sz="4" w:space="1" w:color="auto"/>
+          <w:right w:val="single" w:sz="4" w:space="0" w:color="auto"/>
+        </w:pBdr>
         <w:autoSpaceDE w:val="0"/>
         <w:autoSpaceDN w:val="0"/>
         <w:adjustRightInd w:val="0"/>
@@ -1571,6 +1766,12 @@
     </w:p>
     <w:p>
       <w:pPr>
+        <w:pBdr>
+          <w:top w:val="single" w:sz="4" w:space="1" w:color="auto"/>
+          <w:left w:val="single" w:sz="4" w:space="4" w:color="auto"/>
+          <w:bottom w:val="single" w:sz="4" w:space="1" w:color="auto"/>
+          <w:right w:val="single" w:sz="4" w:space="0" w:color="auto"/>
+        </w:pBdr>
         <w:autoSpaceDE w:val="0"/>
         <w:autoSpaceDN w:val="0"/>
         <w:adjustRightInd w:val="0"/>
@@ -1589,6 +1790,12 @@
     </w:p>
     <w:p>
       <w:pPr>
+        <w:pBdr>
+          <w:top w:val="single" w:sz="4" w:space="1" w:color="auto"/>
+          <w:left w:val="single" w:sz="4" w:space="4" w:color="auto"/>
+          <w:bottom w:val="single" w:sz="4" w:space="1" w:color="auto"/>
+          <w:right w:val="single" w:sz="4" w:space="0" w:color="auto"/>
+        </w:pBdr>
         <w:autoSpaceDE w:val="0"/>
         <w:autoSpaceDN w:val="0"/>
         <w:adjustRightInd w:val="0"/>
@@ -1659,6 +1866,12 @@
     </w:p>
     <w:p>
       <w:pPr>
+        <w:pBdr>
+          <w:top w:val="single" w:sz="4" w:space="1" w:color="auto"/>
+          <w:left w:val="single" w:sz="4" w:space="4" w:color="auto"/>
+          <w:bottom w:val="single" w:sz="4" w:space="1" w:color="auto"/>
+          <w:right w:val="single" w:sz="4" w:space="0" w:color="auto"/>
+        </w:pBdr>
         <w:autoSpaceDE w:val="0"/>
         <w:autoSpaceDN w:val="0"/>
         <w:adjustRightInd w:val="0"/>
@@ -1716,6 +1929,12 @@
     </w:p>
     <w:p>
       <w:pPr>
+        <w:pBdr>
+          <w:top w:val="single" w:sz="4" w:space="1" w:color="auto"/>
+          <w:left w:val="single" w:sz="4" w:space="4" w:color="auto"/>
+          <w:bottom w:val="single" w:sz="4" w:space="1" w:color="auto"/>
+          <w:right w:val="single" w:sz="4" w:space="0" w:color="auto"/>
+        </w:pBdr>
         <w:autoSpaceDE w:val="0"/>
         <w:autoSpaceDN w:val="0"/>
         <w:adjustRightInd w:val="0"/>
@@ -1760,6 +1979,12 @@
     </w:p>
     <w:p>
       <w:pPr>
+        <w:pBdr>
+          <w:top w:val="single" w:sz="4" w:space="1" w:color="auto"/>
+          <w:left w:val="single" w:sz="4" w:space="4" w:color="auto"/>
+          <w:bottom w:val="single" w:sz="4" w:space="1" w:color="auto"/>
+          <w:right w:val="single" w:sz="4" w:space="0" w:color="auto"/>
+        </w:pBdr>
         <w:autoSpaceDE w:val="0"/>
         <w:autoSpaceDN w:val="0"/>
         <w:adjustRightInd w:val="0"/>
@@ -1804,6 +2029,12 @@
     </w:p>
     <w:p>
       <w:pPr>
+        <w:pBdr>
+          <w:top w:val="single" w:sz="4" w:space="1" w:color="auto"/>
+          <w:left w:val="single" w:sz="4" w:space="4" w:color="auto"/>
+          <w:bottom w:val="single" w:sz="4" w:space="1" w:color="auto"/>
+          <w:right w:val="single" w:sz="4" w:space="0" w:color="auto"/>
+        </w:pBdr>
         <w:autoSpaceDE w:val="0"/>
         <w:autoSpaceDN w:val="0"/>
         <w:adjustRightInd w:val="0"/>
@@ -1822,6 +2053,12 @@
     </w:p>
     <w:p>
       <w:pPr>
+        <w:pBdr>
+          <w:top w:val="single" w:sz="4" w:space="1" w:color="auto"/>
+          <w:left w:val="single" w:sz="4" w:space="4" w:color="auto"/>
+          <w:bottom w:val="single" w:sz="4" w:space="1" w:color="auto"/>
+          <w:right w:val="single" w:sz="4" w:space="0" w:color="auto"/>
+        </w:pBdr>
         <w:autoSpaceDE w:val="0"/>
         <w:autoSpaceDN w:val="0"/>
         <w:adjustRightInd w:val="0"/>
@@ -1892,6 +2129,12 @@
     </w:p>
     <w:p>
       <w:pPr>
+        <w:pBdr>
+          <w:top w:val="single" w:sz="4" w:space="1" w:color="auto"/>
+          <w:left w:val="single" w:sz="4" w:space="4" w:color="auto"/>
+          <w:bottom w:val="single" w:sz="4" w:space="1" w:color="auto"/>
+          <w:right w:val="single" w:sz="4" w:space="0" w:color="auto"/>
+        </w:pBdr>
         <w:autoSpaceDE w:val="0"/>
         <w:autoSpaceDN w:val="0"/>
         <w:adjustRightInd w:val="0"/>
@@ -1962,6 +2205,12 @@
     </w:p>
     <w:p>
       <w:pPr>
+        <w:pBdr>
+          <w:top w:val="single" w:sz="4" w:space="1" w:color="auto"/>
+          <w:left w:val="single" w:sz="4" w:space="4" w:color="auto"/>
+          <w:bottom w:val="single" w:sz="4" w:space="1" w:color="auto"/>
+          <w:right w:val="single" w:sz="4" w:space="0" w:color="auto"/>
+        </w:pBdr>
         <w:autoSpaceDE w:val="0"/>
         <w:autoSpaceDN w:val="0"/>
         <w:adjustRightInd w:val="0"/>
@@ -2006,6 +2255,12 @@
     </w:p>
     <w:p>
       <w:pPr>
+        <w:pBdr>
+          <w:top w:val="single" w:sz="4" w:space="1" w:color="auto"/>
+          <w:left w:val="single" w:sz="4" w:space="4" w:color="auto"/>
+          <w:bottom w:val="single" w:sz="4" w:space="1" w:color="auto"/>
+          <w:right w:val="single" w:sz="4" w:space="0" w:color="auto"/>
+        </w:pBdr>
         <w:autoSpaceDE w:val="0"/>
         <w:autoSpaceDN w:val="0"/>
         <w:adjustRightInd w:val="0"/>
@@ -2076,6 +2331,12 @@
     </w:p>
     <w:p>
       <w:pPr>
+        <w:pBdr>
+          <w:top w:val="single" w:sz="4" w:space="1" w:color="auto"/>
+          <w:left w:val="single" w:sz="4" w:space="4" w:color="auto"/>
+          <w:bottom w:val="single" w:sz="4" w:space="1" w:color="auto"/>
+          <w:right w:val="single" w:sz="4" w:space="0" w:color="auto"/>
+        </w:pBdr>
         <w:autoSpaceDE w:val="0"/>
         <w:autoSpaceDN w:val="0"/>
         <w:adjustRightInd w:val="0"/>
@@ -2146,43 +2407,496 @@
     </w:p>
     <w:p/>
     <w:p>
-      <w:r>
-        <w:t>Commit and push the workflow file.</w:t>
-      </w:r>
-    </w:p>
-    <w:p/>
-    <w:p>
-      <w:pPr>
-        <w:pStyle w:val="Heading2"/>
-      </w:pPr>
-      <w:r>
-        <w:t>Step 4: Observe the Pipeline</w:t>
+      <w:pPr>
+        <w:pBdr>
+          <w:top w:val="single" w:sz="4" w:space="1" w:color="auto"/>
+          <w:left w:val="single" w:sz="4" w:space="4" w:color="auto"/>
+          <w:bottom w:val="single" w:sz="4" w:space="1" w:color="auto"/>
+          <w:right w:val="single" w:sz="4" w:space="4" w:color="auto"/>
+        </w:pBdr>
+        <w:spacing w:after="0"/>
+        <w:rPr>
+          <w:rFonts w:ascii="Courier New" w:hAnsi="Courier New" w:cs="Courier New"/>
+          <w:b/>
+          <w:bCs/>
+          <w:sz w:val="24"/>
+          <w:szCs w:val="24"/>
+          <w:lang w:val="en-GB"/>
+        </w:rPr>
+      </w:pPr>
+      <w:r>
+        <w:lastRenderedPageBreak/>
+        <w:t>Save all files and then c</w:t>
+      </w:r>
+      <w:r>
+        <w:t>ommit and push the workflow file.</w:t>
+      </w:r>
+      <w:r>
+        <w:br/>
+      </w:r>
+      <w:r>
+        <w:br/>
+      </w:r>
+      <w:r>
+        <w:rPr>
+          <w:rFonts w:ascii="Courier New" w:hAnsi="Courier New" w:cs="Courier New"/>
+          <w:b/>
+          <w:bCs/>
+          <w:sz w:val="24"/>
+          <w:szCs w:val="24"/>
+          <w:lang w:val="en-GB"/>
+        </w:rPr>
+        <w:t xml:space="preserve">git add </w:t>
+      </w:r>
+      <w:r>
+        <w:rPr>
+          <w:rFonts w:ascii="Courier New" w:hAnsi="Courier New" w:cs="Courier New"/>
+          <w:b/>
+          <w:bCs/>
+          <w:sz w:val="24"/>
+          <w:szCs w:val="24"/>
+          <w:lang w:val="en-GB"/>
+        </w:rPr>
+        <w:t>.</w:t>
       </w:r>
     </w:p>
     <w:p>
-      <w:r>
-        <w:t>Go to the Actions tab in GitHub.</w:t>
+      <w:pPr>
+        <w:pBdr>
+          <w:top w:val="single" w:sz="4" w:space="1" w:color="auto"/>
+          <w:left w:val="single" w:sz="4" w:space="4" w:color="auto"/>
+          <w:bottom w:val="single" w:sz="4" w:space="1" w:color="auto"/>
+          <w:right w:val="single" w:sz="4" w:space="4" w:color="auto"/>
+        </w:pBdr>
+        <w:spacing w:after="0"/>
+        <w:rPr>
+          <w:rFonts w:ascii="Courier New" w:hAnsi="Courier New" w:cs="Courier New"/>
+          <w:b/>
+          <w:bCs/>
+          <w:sz w:val="24"/>
+          <w:szCs w:val="24"/>
+          <w:lang w:val="en-GB"/>
+        </w:rPr>
+      </w:pPr>
+      <w:r>
+        <w:rPr>
+          <w:rFonts w:ascii="Courier New" w:hAnsi="Courier New" w:cs="Courier New"/>
+          <w:b/>
+          <w:bCs/>
+          <w:sz w:val="24"/>
+          <w:szCs w:val="24"/>
+          <w:lang w:val="en-GB"/>
+        </w:rPr>
+        <w:t>git commit -m "</w:t>
+      </w:r>
+      <w:r>
+        <w:rPr>
+          <w:rFonts w:ascii="Courier New" w:hAnsi="Courier New" w:cs="Courier New"/>
+          <w:b/>
+          <w:bCs/>
+          <w:sz w:val="24"/>
+          <w:szCs w:val="24"/>
+          <w:lang w:val="en-GB"/>
+        </w:rPr>
+        <w:t>second</w:t>
+      </w:r>
+      <w:r>
+        <w:rPr>
+          <w:rFonts w:ascii="Courier New" w:hAnsi="Courier New" w:cs="Courier New"/>
+          <w:b/>
+          <w:bCs/>
+          <w:sz w:val="24"/>
+          <w:szCs w:val="24"/>
+          <w:lang w:val="en-GB"/>
+        </w:rPr>
+        <w:t xml:space="preserve"> commit"</w:t>
       </w:r>
     </w:p>
     <w:p>
-      <w:r>
-        <w:t>Click the workflow run and inspect each step output.</w:t>
+      <w:pPr>
+        <w:pBdr>
+          <w:top w:val="single" w:sz="4" w:space="1" w:color="auto"/>
+          <w:left w:val="single" w:sz="4" w:space="4" w:color="auto"/>
+          <w:bottom w:val="single" w:sz="4" w:space="1" w:color="auto"/>
+          <w:right w:val="single" w:sz="4" w:space="4" w:color="auto"/>
+        </w:pBdr>
+        <w:spacing w:after="0"/>
+        <w:rPr>
+          <w:rFonts w:ascii="Courier New" w:hAnsi="Courier New" w:cs="Courier New"/>
+          <w:b/>
+          <w:bCs/>
+          <w:sz w:val="24"/>
+          <w:szCs w:val="24"/>
+          <w:lang w:val="en-GB"/>
+        </w:rPr>
+      </w:pPr>
+      <w:r>
+        <w:rPr>
+          <w:rFonts w:ascii="Courier New" w:hAnsi="Courier New" w:cs="Courier New"/>
+          <w:b/>
+          <w:bCs/>
+          <w:sz w:val="24"/>
+          <w:szCs w:val="24"/>
+          <w:lang w:val="en-GB"/>
+        </w:rPr>
+        <w:t>git push</w:t>
       </w:r>
     </w:p>
     <w:p>
-      <w:pPr>
-        <w:pStyle w:val="Heading2"/>
-      </w:pPr>
+      <w:r>
+        <w:br/>
+      </w:r>
+      <w:r>
+        <w:t>Step 4: Observe the Pipeline</w:t>
+      </w:r>
+      <w:r>
+        <w:br/>
+      </w:r>
     </w:p>
     <w:p>
-      <w:pPr>
-        <w:pStyle w:val="Heading2"/>
-      </w:pPr>
-      <w:r>
-        <w:t>Step 5: Deploy to GitHub Pages</w:t>
+      <w:r>
+        <w:t xml:space="preserve">Select </w:t>
+      </w:r>
+      <w:r>
+        <w:t xml:space="preserve"> the </w:t>
+      </w:r>
+      <w:r>
+        <w:rPr>
+          <w:b/>
+          <w:bCs/>
+          <w:sz w:val="24"/>
+          <w:szCs w:val="24"/>
+        </w:rPr>
+        <w:t>Actions</w:t>
+      </w:r>
+      <w:r>
+        <w:rPr>
+          <w:sz w:val="24"/>
+          <w:szCs w:val="24"/>
+        </w:rPr>
+        <w:t xml:space="preserve"> </w:t>
+      </w:r>
+      <w:r>
+        <w:t>tab in GitHub.</w:t>
+      </w:r>
+      <w:r>
+        <w:br/>
+      </w:r>
+      <w:r>
+        <w:t xml:space="preserve"> </w:t>
+      </w:r>
+      <w:r>
+        <w:br/>
+      </w:r>
+      <w:r>
+        <w:drawing>
+          <wp:inline distT="0" distB="0" distL="0" distR="0" wp14:anchorId="0B7D2CAC" wp14:editId="4A5F6D53">
+            <wp:extent cx="5900797" cy="3209925"/>
+            <wp:effectExtent l="19050" t="19050" r="24130" b="9525"/>
+            <wp:docPr id="1234614374" name="Picture 1"/>
+            <wp:cNvGraphicFramePr>
+              <a:graphicFrameLocks xmlns:a="http://schemas.openxmlformats.org/drawingml/2006/main" noChangeAspect="1"/>
+            </wp:cNvGraphicFramePr>
+            <a:graphic xmlns:a="http://schemas.openxmlformats.org/drawingml/2006/main">
+              <a:graphicData uri="http://schemas.openxmlformats.org/drawingml/2006/picture">
+                <pic:pic xmlns:pic="http://schemas.openxmlformats.org/drawingml/2006/picture">
+                  <pic:nvPicPr>
+                    <pic:cNvPr id="1234614374" name=""/>
+                    <pic:cNvPicPr/>
+                  </pic:nvPicPr>
+                  <pic:blipFill>
+                    <a:blip r:embed="rId7"/>
+                    <a:stretch>
+                      <a:fillRect/>
+                    </a:stretch>
+                  </pic:blipFill>
+                  <pic:spPr>
+                    <a:xfrm>
+                      <a:off x="0" y="0"/>
+                      <a:ext cx="5923606" cy="3222333"/>
+                    </a:xfrm>
+                    <a:prstGeom prst="rect">
+                      <a:avLst/>
+                    </a:prstGeom>
+                    <a:ln>
+                      <a:solidFill>
+                        <a:schemeClr val="bg1">
+                          <a:lumMod val="85000"/>
+                        </a:schemeClr>
+                      </a:solidFill>
+                    </a:ln>
+                  </pic:spPr>
+                </pic:pic>
+              </a:graphicData>
+            </a:graphic>
+          </wp:inline>
+        </w:drawing>
       </w:r>
     </w:p>
     <w:p>
+      <w:r>
+        <w:br/>
+      </w:r>
+      <w:r>
+        <w:rPr>
+          <w:b/>
+          <w:bCs/>
+        </w:rPr>
+        <w:t>Click the workflow run and inspect each step output.</w:t>
+      </w:r>
+      <w:r>
+        <w:drawing>
+          <wp:inline distT="0" distB="0" distL="0" distR="0" wp14:anchorId="35DCA8D8" wp14:editId="609810B1">
+            <wp:extent cx="2629267" cy="552527"/>
+            <wp:effectExtent l="19050" t="19050" r="19050" b="19050"/>
+            <wp:docPr id="763029937" name="Picture 1"/>
+            <wp:cNvGraphicFramePr>
+              <a:graphicFrameLocks xmlns:a="http://schemas.openxmlformats.org/drawingml/2006/main" noChangeAspect="1"/>
+            </wp:cNvGraphicFramePr>
+            <a:graphic xmlns:a="http://schemas.openxmlformats.org/drawingml/2006/main">
+              <a:graphicData uri="http://schemas.openxmlformats.org/drawingml/2006/picture">
+                <pic:pic xmlns:pic="http://schemas.openxmlformats.org/drawingml/2006/picture">
+                  <pic:nvPicPr>
+                    <pic:cNvPr id="763029937" name=""/>
+                    <pic:cNvPicPr/>
+                  </pic:nvPicPr>
+                  <pic:blipFill>
+                    <a:blip r:embed="rId8"/>
+                    <a:stretch>
+                      <a:fillRect/>
+                    </a:stretch>
+                  </pic:blipFill>
+                  <pic:spPr>
+                    <a:xfrm>
+                      <a:off x="0" y="0"/>
+                      <a:ext cx="2629267" cy="552527"/>
+                    </a:xfrm>
+                    <a:prstGeom prst="rect">
+                      <a:avLst/>
+                    </a:prstGeom>
+                    <a:ln>
+                      <a:solidFill>
+                        <a:schemeClr val="bg1">
+                          <a:lumMod val="85000"/>
+                        </a:schemeClr>
+                      </a:solidFill>
+                    </a:ln>
+                  </pic:spPr>
+                </pic:pic>
+              </a:graphicData>
+            </a:graphic>
+          </wp:inline>
+        </w:drawing>
+      </w:r>
+    </w:p>
+    <w:p>
+      <w:pPr>
+        <w:pStyle w:val="Heading2"/>
+      </w:pPr>
+      <w:r>
+        <w:t>Step 5: Deploy to GitHub Pages</w:t>
+      </w:r>
+    </w:p>
+    <w:p>
+      <w:pPr>
+        <w:keepNext/>
+        <w:keepLines/>
+      </w:pPr>
+      <w:r>
+        <w:br/>
+        <w:t>Gith</w:t>
+      </w:r>
+      <w:r>
+        <w:t>u</w:t>
+      </w:r>
+      <w:r>
+        <w:t>b page</w:t>
+      </w:r>
+      <w:r>
+        <w:t xml:space="preserve"> </w:t>
+      </w:r>
+      <w:r>
+        <w:t xml:space="preserve">is designed to host your personal, </w:t>
+      </w:r>
+      <w:proofErr w:type="spellStart"/>
+      <w:r>
+        <w:t>organi</w:t>
+      </w:r>
+      <w:r>
+        <w:t>s</w:t>
+      </w:r>
+      <w:r>
+        <w:t>ation</w:t>
+      </w:r>
+      <w:proofErr w:type="spellEnd"/>
+      <w:r>
+        <w:t>, or project pages from a GitHub repository</w:t>
+      </w:r>
+      <w:r>
+        <w:t xml:space="preserve">. Let’s </w:t>
+      </w:r>
+      <w:proofErr w:type="spellStart"/>
+      <w:r>
+        <w:t>gpst</w:t>
+      </w:r>
+      <w:proofErr w:type="spellEnd"/>
+      <w:r>
+        <w:t xml:space="preserve"> your app on the WWW!</w:t>
+      </w:r>
+      <w:r>
+        <w:br/>
+      </w:r>
+      <w:r>
+        <w:br/>
+        <w:t>Enable Github pages</w:t>
+      </w:r>
+    </w:p>
+    <w:p>
+      <w:r>
+        <w:br w:type="page"/>
+      </w:r>
+    </w:p>
+    <w:p>
+      <w:pPr>
+        <w:keepNext/>
+        <w:keepLines/>
+      </w:pPr>
+      <w:r>
+        <w:lastRenderedPageBreak/>
+        <w:t xml:space="preserve">Elect your repository and then go to its settings   </w:t>
+      </w:r>
+      <w:r>
+        <w:br/>
+      </w:r>
+      <w:r>
+        <w:drawing>
+          <wp:inline distT="0" distB="0" distL="0" distR="0" wp14:anchorId="09633D95" wp14:editId="3A456FFB">
+            <wp:extent cx="1619250" cy="458931"/>
+            <wp:effectExtent l="19050" t="19050" r="19050" b="17780"/>
+            <wp:docPr id="1732611024" name="Picture 1"/>
+            <wp:cNvGraphicFramePr>
+              <a:graphicFrameLocks xmlns:a="http://schemas.openxmlformats.org/drawingml/2006/main" noChangeAspect="1"/>
+            </wp:cNvGraphicFramePr>
+            <a:graphic xmlns:a="http://schemas.openxmlformats.org/drawingml/2006/main">
+              <a:graphicData uri="http://schemas.openxmlformats.org/drawingml/2006/picture">
+                <pic:pic xmlns:pic="http://schemas.openxmlformats.org/drawingml/2006/picture">
+                  <pic:nvPicPr>
+                    <pic:cNvPr id="1732611024" name=""/>
+                    <pic:cNvPicPr/>
+                  </pic:nvPicPr>
+                  <pic:blipFill>
+                    <a:blip r:embed="rId9"/>
+                    <a:stretch>
+                      <a:fillRect/>
+                    </a:stretch>
+                  </pic:blipFill>
+                  <pic:spPr>
+                    <a:xfrm>
+                      <a:off x="0" y="0"/>
+                      <a:ext cx="1627444" cy="461253"/>
+                    </a:xfrm>
+                    <a:prstGeom prst="rect">
+                      <a:avLst/>
+                    </a:prstGeom>
+                    <a:ln>
+                      <a:solidFill>
+                        <a:schemeClr val="bg1">
+                          <a:lumMod val="85000"/>
+                        </a:schemeClr>
+                      </a:solidFill>
+                    </a:ln>
+                  </pic:spPr>
+                </pic:pic>
+              </a:graphicData>
+            </a:graphic>
+          </wp:inline>
+        </w:drawing>
+      </w:r>
+      <w:r>
+        <w:br/>
+      </w:r>
+      <w:r>
+        <w:t xml:space="preserve">Select </w:t>
+      </w:r>
+      <w:r>
+        <w:rPr>
+          <w:b/>
+          <w:bCs/>
+          <w:sz w:val="28"/>
+          <w:szCs w:val="28"/>
+        </w:rPr>
+        <w:t>Pages</w:t>
+      </w:r>
+      <w:r>
+        <w:rPr>
+          <w:sz w:val="28"/>
+          <w:szCs w:val="28"/>
+        </w:rPr>
+        <w:t xml:space="preserve"> </w:t>
+      </w:r>
+      <w:r>
+        <w:t xml:space="preserve">from </w:t>
+      </w:r>
+      <w:r>
+        <w:t>the left menu</w:t>
+      </w:r>
+      <w:r>
+        <w:br/>
+        <w:t>Then select Github Actions as source:</w:t>
+      </w:r>
+      <w:r>
+        <w:br/>
+      </w:r>
+      <w:r>
+        <w:drawing>
+          <wp:inline distT="0" distB="0" distL="0" distR="0" wp14:anchorId="52D2EA9E" wp14:editId="648A7CFE">
+            <wp:extent cx="2628900" cy="2040220"/>
+            <wp:effectExtent l="19050" t="19050" r="19050" b="17780"/>
+            <wp:docPr id="1339601145" name="Picture 1"/>
+            <wp:cNvGraphicFramePr>
+              <a:graphicFrameLocks xmlns:a="http://schemas.openxmlformats.org/drawingml/2006/main" noChangeAspect="1"/>
+            </wp:cNvGraphicFramePr>
+            <a:graphic xmlns:a="http://schemas.openxmlformats.org/drawingml/2006/main">
+              <a:graphicData uri="http://schemas.openxmlformats.org/drawingml/2006/picture">
+                <pic:pic xmlns:pic="http://schemas.openxmlformats.org/drawingml/2006/picture">
+                  <pic:nvPicPr>
+                    <pic:cNvPr id="1339601145" name=""/>
+                    <pic:cNvPicPr/>
+                  </pic:nvPicPr>
+                  <pic:blipFill>
+                    <a:blip r:embed="rId10"/>
+                    <a:stretch>
+                      <a:fillRect/>
+                    </a:stretch>
+                  </pic:blipFill>
+                  <pic:spPr>
+                    <a:xfrm>
+                      <a:off x="0" y="0"/>
+                      <a:ext cx="2632060" cy="2042673"/>
+                    </a:xfrm>
+                    <a:prstGeom prst="rect">
+                      <a:avLst/>
+                    </a:prstGeom>
+                    <a:ln>
+                      <a:solidFill>
+                        <a:schemeClr val="bg1">
+                          <a:lumMod val="85000"/>
+                        </a:schemeClr>
+                      </a:solidFill>
+                    </a:ln>
+                  </pic:spPr>
+                </pic:pic>
+              </a:graphicData>
+            </a:graphic>
+          </wp:inline>
+        </w:drawing>
+      </w:r>
+      <w:r>
+        <w:br/>
+      </w:r>
+      <w:r>
+        <w:br/>
+      </w:r>
       <w:r>
         <w:t xml:space="preserve">Update </w:t>
       </w:r>
@@ -2227,7 +2941,6 @@
           <w:highlight w:val="white"/>
           <w:lang w:val="en-GB"/>
         </w:rPr>
-        <w:lastRenderedPageBreak/>
         <w:t>name:</w:t>
       </w:r>
       <w:r>
@@ -3489,44 +4202,162 @@
     </w:p>
     <w:p/>
     <w:p>
-      <w:r>
+      <w:pPr>
+        <w:keepNext/>
+        <w:keepLines/>
+        <w:rPr>
+          <w:rStyle w:val="Heading2Char"/>
+        </w:rPr>
+      </w:pPr>
+      <w:r>
+        <w:rPr>
+          <w:rStyle w:val="Heading2Char"/>
+        </w:rPr>
+        <w:lastRenderedPageBreak/>
         <w:t>Commit and push the changes.</w:t>
       </w:r>
     </w:p>
     <w:p>
       <w:pPr>
-        <w:pStyle w:val="Heading2"/>
-      </w:pPr>
-      <w:r>
-        <w:t>Step 6: Enable GitHub Pages</w:t>
+        <w:keepNext/>
+        <w:keepLines/>
+      </w:pPr>
+      <w:r>
+        <w:t xml:space="preserve">You will see something similar in the </w:t>
+      </w:r>
+      <w:r>
+        <w:rPr>
+          <w:b/>
+          <w:bCs/>
+        </w:rPr>
+        <w:t>Actions</w:t>
+      </w:r>
+      <w:r>
+        <w:t xml:space="preserve"> tab</w:t>
+      </w:r>
+      <w:r>
+        <w:br/>
+      </w:r>
+      <w:r>
+        <w:drawing>
+          <wp:inline distT="0" distB="0" distL="0" distR="0" wp14:anchorId="7D00E59D" wp14:editId="3A10128A">
+            <wp:extent cx="2772162" cy="2057687"/>
+            <wp:effectExtent l="19050" t="19050" r="28575" b="19050"/>
+            <wp:docPr id="25527581" name="Picture 1"/>
+            <wp:cNvGraphicFramePr>
+              <a:graphicFrameLocks xmlns:a="http://schemas.openxmlformats.org/drawingml/2006/main" noChangeAspect="1"/>
+            </wp:cNvGraphicFramePr>
+            <a:graphic xmlns:a="http://schemas.openxmlformats.org/drawingml/2006/main">
+              <a:graphicData uri="http://schemas.openxmlformats.org/drawingml/2006/picture">
+                <pic:pic xmlns:pic="http://schemas.openxmlformats.org/drawingml/2006/picture">
+                  <pic:nvPicPr>
+                    <pic:cNvPr id="25527581" name=""/>
+                    <pic:cNvPicPr/>
+                  </pic:nvPicPr>
+                  <pic:blipFill>
+                    <a:blip r:embed="rId11"/>
+                    <a:stretch>
+                      <a:fillRect/>
+                    </a:stretch>
+                  </pic:blipFill>
+                  <pic:spPr>
+                    <a:xfrm>
+                      <a:off x="0" y="0"/>
+                      <a:ext cx="2772162" cy="2057687"/>
+                    </a:xfrm>
+                    <a:prstGeom prst="rect">
+                      <a:avLst/>
+                    </a:prstGeom>
+                    <a:ln>
+                      <a:solidFill>
+                        <a:schemeClr val="bg1">
+                          <a:lumMod val="85000"/>
+                        </a:schemeClr>
+                      </a:solidFill>
+                    </a:ln>
+                  </pic:spPr>
+                </pic:pic>
+              </a:graphicData>
+            </a:graphic>
+          </wp:inline>
+        </w:drawing>
       </w:r>
     </w:p>
     <w:p>
-      <w:r>
-        <w:t>Go to Settings → Pages.</w:t>
+      <w:pPr>
+        <w:pStyle w:val="Heading2"/>
+      </w:pPr>
+      <w:r>
+        <w:t>Step 7: View the Deployed App</w:t>
       </w:r>
     </w:p>
     <w:p>
       <w:r>
-        <w:t>Set Source to GitHub Actions and save.</w:t>
+        <w:t>Click</w:t>
+      </w:r>
+      <w:r>
+        <w:t xml:space="preserve"> the GitHub Pages URL</w:t>
+      </w:r>
+      <w:r>
+        <w:t xml:space="preserve"> when it appears (may take some time)</w:t>
+      </w:r>
+      <w:r>
+        <w:t>.</w:t>
+      </w:r>
+      <w:r>
+        <w:br/>
+      </w:r>
+      <w:r>
+        <w:drawing>
+          <wp:inline distT="0" distB="0" distL="0" distR="0" wp14:anchorId="591CBCF9" wp14:editId="04CBEB00">
+            <wp:extent cx="5486400" cy="1366520"/>
+            <wp:effectExtent l="19050" t="19050" r="19050" b="24130"/>
+            <wp:docPr id="903042768" name="Picture 1"/>
+            <wp:cNvGraphicFramePr>
+              <a:graphicFrameLocks xmlns:a="http://schemas.openxmlformats.org/drawingml/2006/main" noChangeAspect="1"/>
+            </wp:cNvGraphicFramePr>
+            <a:graphic xmlns:a="http://schemas.openxmlformats.org/drawingml/2006/main">
+              <a:graphicData uri="http://schemas.openxmlformats.org/drawingml/2006/picture">
+                <pic:pic xmlns:pic="http://schemas.openxmlformats.org/drawingml/2006/picture">
+                  <pic:nvPicPr>
+                    <pic:cNvPr id="903042768" name=""/>
+                    <pic:cNvPicPr/>
+                  </pic:nvPicPr>
+                  <pic:blipFill>
+                    <a:blip r:embed="rId12"/>
+                    <a:stretch>
+                      <a:fillRect/>
+                    </a:stretch>
+                  </pic:blipFill>
+                  <pic:spPr>
+                    <a:xfrm>
+                      <a:off x="0" y="0"/>
+                      <a:ext cx="5486400" cy="1366520"/>
+                    </a:xfrm>
+                    <a:prstGeom prst="rect">
+                      <a:avLst/>
+                    </a:prstGeom>
+                    <a:ln>
+                      <a:solidFill>
+                        <a:schemeClr val="bg1">
+                          <a:lumMod val="85000"/>
+                        </a:schemeClr>
+                      </a:solidFill>
+                    </a:ln>
+                  </pic:spPr>
+                </pic:pic>
+              </a:graphicData>
+            </a:graphic>
+          </wp:inline>
+        </w:drawing>
       </w:r>
     </w:p>
     <w:p>
-      <w:pPr>
-        <w:pStyle w:val="Heading2"/>
-      </w:pPr>
-      <w:r>
-        <w:t>Step 7: View the Deployed App</w:t>
-      </w:r>
-    </w:p>
-    <w:p>
-      <w:r>
-        <w:t>Copy the GitHub Pages URL.</w:t>
-      </w:r>
-    </w:p>
-    <w:p>
-      <w:r>
-        <w:t>Open it in a browser and verify the content.</w:t>
+      <w:r>
+        <w:t>And view</w:t>
+      </w:r>
+      <w:r>
+        <w:t xml:space="preserve"> it in a browser and verify the content.</w:t>
       </w:r>
     </w:p>
     <w:p>
@@ -3741,21 +4572,30 @@
     </w:p>
     <w:p/>
     <w:p>
+      <w:pPr>
+        <w:pStyle w:val="Heading2"/>
+      </w:pPr>
       <w:r>
         <w:t>Commit and push.</w:t>
+      </w:r>
+      <w:r>
+        <w:br/>
       </w:r>
     </w:p>
     <w:p>
       <w:r>
         <w:t>Observe the workflow rerun and refresh the website.</w:t>
       </w:r>
+      <w:r>
+        <w:br/>
+        <w:t>(wait before site is updated by Action)</w:t>
+      </w:r>
     </w:p>
     <w:p>
       <w:pPr>
         <w:pStyle w:val="Heading2"/>
       </w:pPr>
       <w:r>
-        <w:lastRenderedPageBreak/>
         <w:t>Step 9: Break the Build</w:t>
       </w:r>
     </w:p>
@@ -3791,6 +4631,7 @@
     </w:p>
     <w:p>
       <w:r>
+        <w:lastRenderedPageBreak/>
         <w:t>Observe the workflow failure in GitHub Actions.</w:t>
       </w:r>
     </w:p>
@@ -4897,7 +5738,7 @@
   <w:style w:type="paragraph" w:default="1" w:styleId="Normal">
     <w:name w:val="Normal"/>
     <w:qFormat/>
-    <w:rsid w:val="00FC693F"/>
+    <w:rsid w:val="00CB195C"/>
   </w:style>
   <w:style w:type="paragraph" w:styleId="Heading1">
     <w:name w:val="heading 1"/>
@@ -5111,7 +5952,6 @@
   <w:style w:type="character" w:default="1" w:styleId="DefaultParagraphFont">
     <w:name w:val="Default Paragraph Font"/>
     <w:uiPriority w:val="1"/>
-    <w:semiHidden/>
     <w:unhideWhenUsed/>
   </w:style>
   <w:style w:type="table" w:default="1" w:styleId="TableNormal">
@@ -15888,6 +16728,59 @@
       </w:tcPr>
     </w:tblStylePr>
   </w:style>
+  <w:style w:type="paragraph" w:styleId="HTMLPreformatted">
+    <w:name w:val="HTML Preformatted"/>
+    <w:basedOn w:val="Normal"/>
+    <w:link w:val="HTMLPreformattedChar"/>
+    <w:uiPriority w:val="99"/>
+    <w:semiHidden/>
+    <w:unhideWhenUsed/>
+    <w:rsid w:val="000E2942"/>
+    <w:pPr>
+      <w:spacing w:after="0" w:line="240" w:lineRule="auto"/>
+    </w:pPr>
+    <w:rPr>
+      <w:rFonts w:ascii="Consolas" w:hAnsi="Consolas"/>
+      <w:sz w:val="20"/>
+      <w:szCs w:val="20"/>
+    </w:rPr>
+  </w:style>
+  <w:style w:type="character" w:customStyle="1" w:styleId="HTMLPreformattedChar">
+    <w:name w:val="HTML Preformatted Char"/>
+    <w:basedOn w:val="DefaultParagraphFont"/>
+    <w:link w:val="HTMLPreformatted"/>
+    <w:uiPriority w:val="99"/>
+    <w:semiHidden/>
+    <w:rsid w:val="000E2942"/>
+    <w:rPr>
+      <w:rFonts w:ascii="Consolas" w:hAnsi="Consolas"/>
+      <w:sz w:val="20"/>
+      <w:szCs w:val="20"/>
+    </w:rPr>
+  </w:style>
+  <w:style w:type="character" w:styleId="Hyperlink">
+    <w:name w:val="Hyperlink"/>
+    <w:basedOn w:val="DefaultParagraphFont"/>
+    <w:uiPriority w:val="99"/>
+    <w:unhideWhenUsed/>
+    <w:rsid w:val="00AB0EBA"/>
+    <w:rPr>
+      <w:color w:val="0000FF" w:themeColor="hyperlink"/>
+      <w:u w:val="single"/>
+    </w:rPr>
+  </w:style>
+  <w:style w:type="character" w:styleId="UnresolvedMention">
+    <w:name w:val="Unresolved Mention"/>
+    <w:basedOn w:val="DefaultParagraphFont"/>
+    <w:uiPriority w:val="99"/>
+    <w:semiHidden/>
+    <w:unhideWhenUsed/>
+    <w:rsid w:val="00AB0EBA"/>
+    <w:rPr>
+      <w:color w:val="605E5C"/>
+      <w:shd w:val="clear" w:color="auto" w:fill="E1DFDD"/>
+    </w:rPr>
+  </w:style>
 </w:styles>
 </file>
 

</xml_diff>